<commit_message>
docs: add the review presentation outline and correct the abstract word count
</commit_message>
<xml_diff>
--- a/docs/Project_Report.docx
+++ b/docs/Project_Report.docx
@@ -98,6 +98,14 @@
     <w:p>
       <w:r>
         <w:t>The planned AWS deployment spans three accounts. AWS Config, CloudTrail and Cost and Usage Reports feed Amazon S3; Lambda and Glue normalise that evidence into Neo4j on EC2; SageMaker trains the models; API Gateway and Cognito expose and authenticate the interface; IAM separates harvesting from writing; CloudWatch, Budgets and SNS provide monitoring, cost control and notification.</w:t>
+      </w:r>
+    </w:p>
+    <w:p>
+      <w:r>
+        <w:rPr>
+          <w:i/>
+        </w:rPr>
+        <w:t>(296 words)</w:t>
       </w:r>
     </w:p>
     <w:p/>

</xml_diff>